<commit_message>
3.3V Aux & 12V power
</commit_message>
<xml_diff>
--- a/PCB/Stackup and Design Considerations.docx
+++ b/PCB/Stackup and Design Considerations.docx
@@ -9,7 +9,6 @@
           <w:bCs/>
         </w:rPr>
       </w:pPr>
-      <w:proofErr w:type="spellStart"/>
       <w:r>
         <w:rPr>
           <w:b/>
@@ -17,7 +16,6 @@
         </w:rPr>
         <w:t>Stackup</w:t>
       </w:r>
-      <w:proofErr w:type="spellEnd"/>
     </w:p>
     <w:p>
       <w:r>
@@ -1779,9 +1777,398 @@
     </w:tbl>
     <w:p/>
     <w:p/>
+    <w:p/>
+    <w:p/>
+    <w:p/>
+    <w:p/>
+    <w:tbl>
+      <w:tblPr>
+        <w:tblStyle w:val="TableGrid"/>
+        <w:tblW w:w="0" w:type="auto"/>
+        <w:tblLook w:val="04A0" w:firstRow="1" w:lastRow="0" w:firstColumn="1" w:lastColumn="0" w:noHBand="0" w:noVBand="1"/>
+      </w:tblPr>
+      <w:tblGrid>
+        <w:gridCol w:w="1800"/>
+        <w:gridCol w:w="1322"/>
+        <w:gridCol w:w="1581"/>
+        <w:gridCol w:w="1643"/>
+        <w:gridCol w:w="1564"/>
+        <w:gridCol w:w="1440"/>
+      </w:tblGrid>
+      <w:tr>
+        <w:tc>
+          <w:tcPr>
+            <w:tcW w:w="1800" w:type="dxa"/>
+          </w:tcPr>
+          <w:p>
+            <w:r>
+              <w:t>Protocol</w:t>
+            </w:r>
+          </w:p>
+        </w:tc>
+        <w:tc>
+          <w:tcPr>
+            <w:tcW w:w="1322" w:type="dxa"/>
+          </w:tcPr>
+          <w:p>
+            <w:r>
+              <w:t>Layer</w:t>
+            </w:r>
+          </w:p>
+        </w:tc>
+        <w:tc>
+          <w:tcPr>
+            <w:tcW w:w="1581" w:type="dxa"/>
+          </w:tcPr>
+          <w:p>
+            <w:r>
+              <w:t>Trace Width</w:t>
+            </w:r>
+          </w:p>
+        </w:tc>
+        <w:tc>
+          <w:tcPr>
+            <w:tcW w:w="1643" w:type="dxa"/>
+          </w:tcPr>
+          <w:p>
+            <w:r>
+              <w:t>Trace Spacing</w:t>
+            </w:r>
+          </w:p>
+        </w:tc>
+        <w:tc>
+          <w:tcPr>
+            <w:tcW w:w="1564" w:type="dxa"/>
+          </w:tcPr>
+          <w:p>
+            <w:r>
+              <w:t>Target Single</w:t>
+            </w:r>
+          </w:p>
+        </w:tc>
+        <w:tc>
+          <w:tcPr>
+            <w:tcW w:w="1440" w:type="dxa"/>
+          </w:tcPr>
+          <w:p>
+            <w:r>
+              <w:t>Target Diff</w:t>
+            </w:r>
+          </w:p>
+        </w:tc>
+      </w:tr>
+      <w:tr>
+        <w:trPr>
+          <w:trHeight w:val="809"/>
+        </w:trPr>
+        <w:tc>
+          <w:tcPr>
+            <w:tcW w:w="1800" w:type="dxa"/>
+          </w:tcPr>
+          <w:p>
+            <w:r>
+              <w:t>90ohm diff</w:t>
+            </w:r>
+          </w:p>
+          <w:p>
+            <w:r>
+              <w:t>50ohm single</w:t>
+            </w:r>
+          </w:p>
+        </w:tc>
+        <w:tc>
+          <w:tcPr>
+            <w:tcW w:w="1322" w:type="dxa"/>
+          </w:tcPr>
+          <w:p>
+            <w:r>
+              <w:t>L1/L6</w:t>
+            </w:r>
+          </w:p>
+        </w:tc>
+        <w:tc>
+          <w:tcPr>
+            <w:tcW w:w="1581" w:type="dxa"/>
+          </w:tcPr>
+          <w:p>
+            <w:r>
+              <w:t>4.31mil</w:t>
+            </w:r>
+          </w:p>
+        </w:tc>
+        <w:tc>
+          <w:tcPr>
+            <w:tcW w:w="1643" w:type="dxa"/>
+          </w:tcPr>
+          <w:p>
+            <w:r>
+              <w:t>6.4mil</w:t>
+            </w:r>
+          </w:p>
+        </w:tc>
+        <w:tc>
+          <w:tcPr>
+            <w:tcW w:w="1564" w:type="dxa"/>
+          </w:tcPr>
+          <w:p>
+            <w:r>
+              <w:t>50ohm</w:t>
+            </w:r>
+          </w:p>
+        </w:tc>
+        <w:tc>
+          <w:tcPr>
+            <w:tcW w:w="1440" w:type="dxa"/>
+          </w:tcPr>
+          <w:p>
+            <w:r>
+              <w:t>90ohm</w:t>
+            </w:r>
+          </w:p>
+        </w:tc>
+      </w:tr>
+      <w:tr>
+        <w:tc>
+          <w:tcPr>
+            <w:tcW w:w="1800" w:type="dxa"/>
+          </w:tcPr>
+          <w:p>
+            <w:r>
+              <w:t>USB 3.1</w:t>
+            </w:r>
+            <w:r>
+              <w:t>, USB 2.0,</w:t>
+            </w:r>
+            <w:r>
+              <w:t xml:space="preserve"> SuperSpeed</w:t>
+            </w:r>
+            <w:r>
+              <w:t xml:space="preserve"> &amp; PCIe, HDMI, DP, DDR4 Differential</w:t>
+            </w:r>
+          </w:p>
+        </w:tc>
+        <w:tc>
+          <w:tcPr>
+            <w:tcW w:w="1322" w:type="dxa"/>
+          </w:tcPr>
+          <w:p>
+            <w:r>
+              <w:t>L1/L6</w:t>
+            </w:r>
+          </w:p>
+        </w:tc>
+        <w:tc>
+          <w:tcPr>
+            <w:tcW w:w="1581" w:type="dxa"/>
+          </w:tcPr>
+          <w:p>
+            <w:r>
+              <w:t>4.02mil</w:t>
+            </w:r>
+          </w:p>
+        </w:tc>
+        <w:tc>
+          <w:tcPr>
+            <w:tcW w:w="1643" w:type="dxa"/>
+          </w:tcPr>
+          <w:p>
+            <w:r>
+              <w:t>5.4mil</w:t>
+            </w:r>
+          </w:p>
+        </w:tc>
+        <w:tc>
+          <w:tcPr>
+            <w:tcW w:w="1564" w:type="dxa"/>
+          </w:tcPr>
+          <w:p>
+            <w:r>
+              <w:t>-</w:t>
+            </w:r>
+          </w:p>
+        </w:tc>
+        <w:tc>
+          <w:tcPr>
+            <w:tcW w:w="1440" w:type="dxa"/>
+          </w:tcPr>
+          <w:p>
+            <w:r>
+              <w:t>90ohm</w:t>
+            </w:r>
+          </w:p>
+        </w:tc>
+      </w:tr>
+      <w:tr>
+        <w:trPr>
+          <w:trHeight w:val="809"/>
+        </w:trPr>
+        <w:tc>
+          <w:tcPr>
+            <w:tcW w:w="1800" w:type="dxa"/>
+          </w:tcPr>
+          <w:p>
+            <w:r>
+              <w:t>DDR4, RGMII, SDMMC</w:t>
+            </w:r>
+          </w:p>
+        </w:tc>
+        <w:tc>
+          <w:tcPr>
+            <w:tcW w:w="1322" w:type="dxa"/>
+          </w:tcPr>
+          <w:p>
+            <w:r>
+              <w:t>L1/L6</w:t>
+            </w:r>
+          </w:p>
+        </w:tc>
+        <w:tc>
+          <w:tcPr>
+            <w:tcW w:w="1581" w:type="dxa"/>
+          </w:tcPr>
+          <w:p>
+            <w:r>
+              <w:t>4.31mil</w:t>
+            </w:r>
+          </w:p>
+        </w:tc>
+        <w:tc>
+          <w:tcPr>
+            <w:tcW w:w="1643" w:type="dxa"/>
+          </w:tcPr>
+          <w:p>
+            <w:r>
+              <w:t>-</w:t>
+            </w:r>
+          </w:p>
+        </w:tc>
+        <w:tc>
+          <w:tcPr>
+            <w:tcW w:w="1564" w:type="dxa"/>
+          </w:tcPr>
+          <w:p>
+            <w:r>
+              <w:t>50ohm</w:t>
+            </w:r>
+          </w:p>
+        </w:tc>
+        <w:tc>
+          <w:tcPr>
+            <w:tcW w:w="1440" w:type="dxa"/>
+          </w:tcPr>
+          <w:p>
+            <w:r>
+              <w:t>-</w:t>
+            </w:r>
+          </w:p>
+        </w:tc>
+      </w:tr>
+      <w:tr>
+        <w:trPr>
+          <w:trHeight w:val="800"/>
+        </w:trPr>
+        <w:tc>
+          <w:tcPr>
+            <w:tcW w:w="1800" w:type="dxa"/>
+          </w:tcPr>
+          <w:p>
+            <w:r>
+              <w:t>DDR4, RGMII, SDMMC</w:t>
+            </w:r>
+          </w:p>
+        </w:tc>
+        <w:tc>
+          <w:tcPr>
+            <w:tcW w:w="1322" w:type="dxa"/>
+          </w:tcPr>
+          <w:p>
+            <w:r>
+              <w:t>L3/L4</w:t>
+            </w:r>
+          </w:p>
+        </w:tc>
+        <w:tc>
+          <w:tcPr>
+            <w:tcW w:w="1581" w:type="dxa"/>
+          </w:tcPr>
+          <w:p>
+            <w:r>
+              <w:t>4.0mil</w:t>
+            </w:r>
+          </w:p>
+        </w:tc>
+        <w:tc>
+          <w:tcPr>
+            <w:tcW w:w="1643" w:type="dxa"/>
+          </w:tcPr>
+          <w:p>
+            <w:r>
+              <w:t>-</w:t>
+            </w:r>
+          </w:p>
+        </w:tc>
+        <w:tc>
+          <w:tcPr>
+            <w:tcW w:w="1564" w:type="dxa"/>
+          </w:tcPr>
+          <w:p>
+            <w:r>
+              <w:t>48.88ohm</w:t>
+            </w:r>
+          </w:p>
+        </w:tc>
+        <w:tc>
+          <w:tcPr>
+            <w:tcW w:w="1440" w:type="dxa"/>
+          </w:tcPr>
+          <w:p/>
+        </w:tc>
+      </w:tr>
+      <w:tr>
+        <w:trPr>
+          <w:trHeight w:val="890"/>
+        </w:trPr>
+        <w:tc>
+          <w:tcPr>
+            <w:tcW w:w="1800" w:type="dxa"/>
+          </w:tcPr>
+          <w:p/>
+        </w:tc>
+        <w:tc>
+          <w:tcPr>
+            <w:tcW w:w="1322" w:type="dxa"/>
+          </w:tcPr>
+          <w:p/>
+        </w:tc>
+        <w:tc>
+          <w:tcPr>
+            <w:tcW w:w="1581" w:type="dxa"/>
+          </w:tcPr>
+          <w:p/>
+        </w:tc>
+        <w:tc>
+          <w:tcPr>
+            <w:tcW w:w="1643" w:type="dxa"/>
+          </w:tcPr>
+          <w:p/>
+        </w:tc>
+        <w:tc>
+          <w:tcPr>
+            <w:tcW w:w="1564" w:type="dxa"/>
+          </w:tcPr>
+          <w:p/>
+        </w:tc>
+        <w:tc>
+          <w:tcPr>
+            <w:tcW w:w="1440" w:type="dxa"/>
+          </w:tcPr>
+          <w:p/>
+        </w:tc>
+      </w:tr>
+    </w:tbl>
+    <w:p/>
     <w:p>
       <w:r>
-        <w:lastRenderedPageBreak/>
         <w:t>For non-coplanar keep trace spacing between neighboring traces 3 times the width apart if measuring from the center. This means trace spacing would be equal 2x the trace width.</w:t>
       </w:r>
     </w:p>
@@ -1795,6 +2182,7 @@
     <w:p/>
     <w:p>
       <w:r>
+        <w:lastRenderedPageBreak/>
         <w:drawing>
           <wp:inline distT="0" distB="0" distL="0" distR="0" wp14:anchorId="15530515" wp14:editId="50969F4B">
             <wp:extent cx="5943600" cy="2080895"/>

</xml_diff>